<commit_message>
Update documento con BPMN y diagramas de clases
</commit_message>
<xml_diff>
--- a/Documento/Word/Informe_Avance2_Grupo1.docx
+++ b/Documento/Word/Informe_Avance2_Grupo1.docx
@@ -19,12 +19,12 @@
           <wp:inline distB="0" distT="0" distL="0" distR="0">
             <wp:extent cx="2011680" cy="967740"/>
             <wp:effectExtent b="0" l="0" r="0" t="0"/>
-            <wp:docPr descr="Blue text on a black background&#10;&#10;Description automatically generated" id="6" name="image5.png"/>
+            <wp:docPr descr="Blue text on a black background  Description automatically generated" id="6" name="image5.png"/>
             <a:graphic>
               <a:graphicData uri="http://schemas.openxmlformats.org/drawingml/2006/picture">
                 <pic:pic>
                   <pic:nvPicPr>
-                    <pic:cNvPr descr="Blue text on a black background&#10;&#10;Description automatically generated" id="0" name="image5.png"/>
+                    <pic:cNvPr descr="Blue text on a black background  Description automatically generated" id="0" name="image5.png"/>
                     <pic:cNvPicPr preferRelativeResize="0"/>
                   </pic:nvPicPr>
                   <pic:blipFill>
@@ -5783,7 +5783,7 @@
         <w:rPr>
           <w:rtl w:val="0"/>
         </w:rPr>
-        <w:t xml:space="preserve">La transformación digital ha generado cambios significativos en la forma en que las organizaciones gestionan sus procesos y administran la información necesaria para cumplir sus objetivos. En el sector salud, la adopción de sistemas de información se ha convertido en una necesidad para mejorar la eficiencia operativa, optimizar la atención de los pacientes y garantizar la disponibilidad de información clínica confiable y actualizada (Campos Castro, 2026a). A esto se suma la obligación de proteger los datos personales de los pacientes conforme a regulaciones de privacidad como la Ley de Portabilidad y Responsabilidad de Seguros Médicos (HIPAA) de Estados Unidos, la cual establece estándares estrictos para la seguridad, confidencialidad y uso adecuado de la información médica protegida (U.S. Department of Health and Human Services, s.f.).</w:t>
+        <w:t xml:space="preserve">La transformación digital ha generado cambios significativos en la forma en que las organizaciones gestionan sus procesos y administran la información necesaria para cumplir sus objetivos. En el sector salud, la adopción de sistemas de información se ha convertido en una necesidad para mejorar la eficiencia operativa, optimizar la atención de los pacientes y garantizar la disponibilidad de información clínica confiable y actualizada. A esto se suma la obligación de proteger los datos personales de los pacientes conforme a regulaciones de privacidad como la Ley de Portabilidad y Responsabilidad de Seguros Médicos (HIPAA) de Estados Unidos, la cual establece estándares estrictos para la seguridad, confidencialidad y uso adecuado de la información médica protegida (U.S. Department of Health and Human Services, s.f.).</w:t>
       </w:r>
     </w:p>
     <w:p>
@@ -5831,19 +5831,7 @@
         <w:rPr>
           <w:rtl w:val="0"/>
         </w:rPr>
-        <w:t xml:space="preserve">Con base en lo anterior, el presente proyecto tiene como propósito el análisis y diseño conceptual de </w:t>
-      </w:r>
-      <w:r>
-        <w:rPr>
-          <w:rtl w:val="0"/>
-        </w:rPr>
-        <w:t xml:space="preserve">iMedical+</w:t>
-      </w:r>
-      <w:r>
-        <w:rPr>
-          <w:rtl w:val="0"/>
-        </w:rPr>
-        <w:t xml:space="preserve">, una aplicación SaaS multitenant propiedad de iData S.A. que será alquilada a diversas clínicas para la gestión integral de pacientes, citas médicas, expedientes clínicos, diagnósticos y recetas. La solución contempla una versión web para la gestión interna de cada clínica y una aplicación móvil mediante la cual los pacientes pueden consultar su historial médico, fortaleciendo la continuidad y la calidad del servicio.</w:t>
+        <w:t xml:space="preserve">Con base en lo anterior, el presente proyecto tiene como propósito el análisis y diseño conceptual de iMedical+, una aplicación SaaS multitenant propiedad de iData S.A. que será alquilada a diversas clínicas para la gestión integral de pacientes, citas médicas, expedientes clínicos, diagnósticos y recetas. La solución contempla una versión web para la gestión interna de cada clínica y una aplicación móvil mediante la cual los pacientes pueden consultar su historial médico, fortaleciendo la continuidad y la calidad del servicio.</w:t>
       </w:r>
     </w:p>
     <w:p>
@@ -5911,11 +5899,6 @@
           <w:rtl w:val="0"/>
         </w:rPr>
         <w:t xml:space="preserve">Requerimientos Funcionales</w:t>
-      </w:r>
-      <w:r>
-        <w:rPr>
-          <w:rtl w:val="0"/>
-        </w:rPr>
       </w:r>
     </w:p>
     <w:p>
@@ -9159,19 +9142,7 @@
         <w:rPr>
           <w:rtl w:val="0"/>
         </w:rPr>
-        <w:t xml:space="preserve">Definen los componentes técnicos, de infraestructura y seguridad necesarios para garantizar el correcto funcionamiento de la plataforma SaaS multitenant </w:t>
-      </w:r>
-      <w:r>
-        <w:rPr>
-          <w:rtl w:val="0"/>
-        </w:rPr>
-        <w:t xml:space="preserve">iMedical+</w:t>
-      </w:r>
-      <w:r>
-        <w:rPr>
-          <w:rtl w:val="0"/>
-        </w:rPr>
-        <w:t xml:space="preserve">. Debido a la necesidad de contar con una plataforma escalable, segura y disponible para múltiples clínicas (tenants) y usuarios concurrentes, se propone una arquitectura basada en servicios en la nube utilizando Microsoft Azure.</w:t>
+        <w:t xml:space="preserve">Definen los componentes técnicos, de infraestructura y seguridad necesarios para garantizar el correcto funcionamiento de la plataforma SaaS multitenant iMedical+. Debido a la necesidad de contar con una plataforma escalable, segura y disponible para múltiples clínicas (tenants) y usuarios concurrentes, se propone una arquitectura basada en servicios en la nube utilizando Microsoft Azure.</w:t>
       </w:r>
     </w:p>
     <w:p>
@@ -9188,11 +9159,6 @@
           <w:rtl w:val="0"/>
         </w:rPr>
         <w:t xml:space="preserve">Especificaciones de Seguridad</w:t>
-      </w:r>
-      <w:r>
-        <w:rPr>
-          <w:rtl w:val="0"/>
-        </w:rPr>
       </w:r>
     </w:p>
     <w:p>
@@ -11568,19 +11534,7 @@
         <w:rPr>
           <w:rtl w:val="0"/>
         </w:rPr>
-        <w:t xml:space="preserve">En el caso de </w:t>
-      </w:r>
-      <w:r>
-        <w:rPr>
-          <w:rtl w:val="0"/>
-        </w:rPr>
-        <w:t xml:space="preserve">iMedical+</w:t>
-      </w:r>
-      <w:r>
-        <w:rPr>
-          <w:rtl w:val="0"/>
-        </w:rPr>
-        <w:t xml:space="preserve">, el dominio núcleo corresponde a la gestión clínica: la prestación y administración de servicios de atención médica orientados al diagnóstico, tratamiento y seguimiento de pacientes, lo que incluye la administración de pacientes, citas, expedientes, diagnósticos, tratamientos y recetas. Adicionalmente, por tratarse de una solución SaaS multitenant, el dominio incorpora la administración del servicio (gestión de clínicas o tenants, planes y facturación) como subdominio de soporte que sostiene el modelo de alquiler a múltiples clínicas.</w:t>
+        <w:t xml:space="preserve">En el caso de iMedical+, el dominio núcleo corresponde a la gestión clínica: la prestación y administración de servicios de atención médica orientados al diagnóstico, tratamiento y seguimiento de pacientes, lo que incluye la administración de pacientes, citas, expedientes, diagnósticos, tratamientos y recetas. Adicionalmente, por tratarse de una solución SaaS multitenant, el dominio incorpora la administración del servicio (gestión de clínicas o tenants, planes y facturación) como subdominio de soporte que sostiene el modelo de alquiler a múltiples clínicas.</w:t>
       </w:r>
     </w:p>
     <w:p>
@@ -11592,7 +11546,7 @@
         <w:rPr>
           <w:rtl w:val="0"/>
         </w:rPr>
-        <w:t xml:space="preserve">De acuerdo con los principios de Domain Driven Design, comprender correctamente el dominio permite desarrollar soluciones alineadas con las necesidades reales del negocio, facilitando la comunicación entre los expertos del área médica y los equipos responsables del diseño y desarrollo de software (Hiberus, 2023; Campos Castro, 2026c).</w:t>
+        <w:t xml:space="preserve">De acuerdo con los principios de Domain Driven Design, comprender correctamente el dominio permite desarrollar soluciones alineadas con las necesidades reales del negocio, facilitando la comunicación entre los expertos del área médica y los equipos responsables del diseño y desarrollo de software (Hiberus, 2023).</w:t>
       </w:r>
     </w:p>
     <w:p>
@@ -11618,7 +11572,7 @@
         <w:rPr>
           <w:rtl w:val="0"/>
         </w:rPr>
-        <w:t xml:space="preserve">Los subdominios representan divisiones especializadas del dominio principal. Cada uno posee responsabilidades específicas, reglas de negocio particulares y procesos que contribuyen al cumplimiento de los objetivos generales de la organización. (Campos Castro, 2026c).</w:t>
+        <w:t xml:space="preserve">Los subdominios representan divisiones especializadas del dominio principal. Cada uno posee responsabilidades específicas, reglas de negocio particulares y procesos que contribuyen al cumplimiento de los objetivos generales de la organización.</w:t>
       </w:r>
     </w:p>
     <w:p>
@@ -11960,19 +11914,7 @@
         <w:rPr>
           <w:rtl w:val="0"/>
         </w:rPr>
-        <w:t xml:space="preserve">Este subdominio corresponde al canal móvil de </w:t>
-      </w:r>
-      <w:r>
-        <w:rPr>
-          <w:rtl w:val="0"/>
-        </w:rPr>
-        <w:t xml:space="preserve">iMedical+</w:t>
-      </w:r>
-      <w:r>
-        <w:rPr>
-          <w:rtl w:val="0"/>
-        </w:rPr>
-        <w:t xml:space="preserve">, mediante el cual los pacientes acceden, desde su propio dispositivo, a la consulta en solo lectura de su historial clínico, recetas y citas programadas, extendiendo el servicio más allá de la gestión interna de la clínica.</w:t>
+        <w:t xml:space="preserve">Este subdominio corresponde al canal móvil de iMedical+, mediante el cual los pacientes acceden, desde su propio dispositivo, a la consulta en solo lectura de su historial clínico, recetas y citas programadas, extendiendo el servicio más allá de la gestión interna de la clínica.</w:t>
       </w:r>
     </w:p>
     <w:p>
@@ -12011,19 +11953,7 @@
         <w:rPr>
           <w:rtl w:val="0"/>
         </w:rPr>
-        <w:t xml:space="preserve">En el contexto de </w:t>
-      </w:r>
-      <w:r>
-        <w:rPr>
-          <w:rtl w:val="0"/>
-        </w:rPr>
-        <w:t xml:space="preserve">iMedical+</w:t>
-      </w:r>
-      <w:r>
-        <w:rPr>
-          <w:rtl w:val="0"/>
-        </w:rPr>
-        <w:t xml:space="preserve">, el lenguaje ubicuo está conformado por los conceptos que utilizan diariamente médicos, asistentes de enfermería, recepcionistas, jefaturas, administradores de iData y desarrolladores para referirse a los procesos y elementos fundamentales del negocio.</w:t>
+        <w:t xml:space="preserve">En el contexto de iMedical+, el lenguaje ubicuo está conformado por los conceptos que utilizan diariamente médicos, asistentes de enfermería, recepcionistas, jefaturas, administradores de iData y desarrolladores para referirse a los procesos y elementos fundamentales del negocio.</w:t>
       </w:r>
     </w:p>
     <w:p>
@@ -12386,19 +12316,7 @@
         <w:rPr>
           <w:rtl w:val="0"/>
         </w:rPr>
-        <w:t xml:space="preserve">Cada una de las clínicas que alquila </w:t>
-      </w:r>
-      <w:r>
-        <w:rPr>
-          <w:rtl w:val="0"/>
-        </w:rPr>
-        <w:t xml:space="preserve">iMedical+</w:t>
-      </w:r>
-      <w:r>
-        <w:rPr>
-          <w:rtl w:val="0"/>
-        </w:rPr>
-        <w:t xml:space="preserve">. En el modelo multitenant, una sola instancia del software atiende a múltiples tenants compartiendo la infraestructura pero manteniendo aislados sus datos (IBM, 2024).</w:t>
+        <w:t xml:space="preserve">Cada una de las clínicas que alquila iMedical+. En el modelo multitenant, una sola instancia del software atiende a múltiples tenants compartiendo la infraestructura pero manteniendo aislados sus datos (IBM, 2024).</w:t>
       </w:r>
     </w:p>
     <w:p>
@@ -12425,19 +12343,7 @@
         <w:rPr>
           <w:rtl w:val="0"/>
         </w:rPr>
-        <w:t xml:space="preserve">Empresa propietaria y proveedora de la plataforma </w:t>
-      </w:r>
-      <w:r>
-        <w:rPr>
-          <w:rtl w:val="0"/>
-        </w:rPr>
-        <w:t xml:space="preserve">iMedical+</w:t>
-      </w:r>
-      <w:r>
-        <w:rPr>
-          <w:rtl w:val="0"/>
-        </w:rPr>
-        <w:t xml:space="preserve">, responsable de administrar las clínicas (tenants), los planes de servicio y la operación general del SaaS.</w:t>
+        <w:t xml:space="preserve">Empresa propietaria y proveedora de la plataforma iMedical+, responsable de administrar las clínicas (tenants), los planes de servicio y la operación general del SaaS.</w:t>
       </w:r>
     </w:p>
     <w:p>
@@ -12572,19 +12478,7 @@
         <w:rPr>
           <w:rtl w:val="0"/>
         </w:rPr>
-        <w:t xml:space="preserve">Modalidad contratada por cada clínica que determina las funcionalidades, los límites y el costo del servicio SaaS de </w:t>
-      </w:r>
-      <w:r>
-        <w:rPr>
-          <w:rtl w:val="0"/>
-        </w:rPr>
-        <w:t xml:space="preserve">iMedical+</w:t>
-      </w:r>
-      <w:r>
-        <w:rPr>
-          <w:rtl w:val="0"/>
-        </w:rPr>
-        <w:t xml:space="preserve">.</w:t>
+        <w:t xml:space="preserve">Modalidad contratada por cada clínica que determina las funcionalidades, los límites y el costo del servicio SaaS de iMedical+.</w:t>
       </w:r>
     </w:p>
     <w:p>
@@ -12611,19 +12505,7 @@
         <w:rPr>
           <w:rtl w:val="0"/>
         </w:rPr>
-        <w:t xml:space="preserve">Canal móvil de </w:t>
-      </w:r>
-      <w:r>
-        <w:rPr>
-          <w:rtl w:val="0"/>
-        </w:rPr>
-        <w:t xml:space="preserve">iMedical+</w:t>
-      </w:r>
-      <w:r>
-        <w:rPr>
-          <w:rtl w:val="0"/>
-        </w:rPr>
-        <w:t xml:space="preserve"> que permite al paciente consultar, en solo lectura, su historial clínico, recetas y citas desde su dispositivo.</w:t>
+        <w:t xml:space="preserve">Canal móvil de iMedical+ que permite al paciente consultar, en solo lectura, su historial clínico, recetas y citas desde su dispositivo.</w:t>
       </w:r>
     </w:p>
     <w:p>
@@ -12649,19 +12531,7 @@
         <w:rPr>
           <w:rtl w:val="0"/>
         </w:rPr>
-        <w:t xml:space="preserve">El modelado de los procesos del negocio permite representar de forma clara las actividades, los actores y los flujos de trabajo de la clínica, facilitando su comprensión y mejora (Campos Castro, 2026b). A continuación se presentan los procesos principales de </w:t>
-      </w:r>
-      <w:r>
-        <w:rPr>
-          <w:rtl w:val="0"/>
-        </w:rPr>
-        <w:t xml:space="preserve">iMedical+</w:t>
-      </w:r>
-      <w:r>
-        <w:rPr>
-          <w:rtl w:val="0"/>
-        </w:rPr>
-        <w:t xml:space="preserve"> mediante un diagrama BPMN 2.0 y los casos de uso más relevantes (Qflow BPM, s.f.).</w:t>
+        <w:t xml:space="preserve">El modelado de los procesos del negocio permite representar de forma clara las actividades, los actores y los flujos de trabajo de la clínica, facilitando su comprensión y mejora. A continuación se presentan los procesos principales de iMedical+ mediante un diagrama BPMN 2.0 y los casos de uso más relevantes (Qflow BPM, s.f.).</w:t>
       </w:r>
     </w:p>
     <w:p>
@@ -12688,19 +12558,106 @@
         <w:rPr>
           <w:rtl w:val="0"/>
         </w:rPr>
-        <w:t xml:space="preserve">Para representar los procesos del negocio de la clínica se utilizó la notación estándar BPMN 2.0, que permite documentar de forma clara las actividades, los roles y los flujos de trabajo de la organización (Qflow BPM, s.f.; Campos Castro, 2026b). Se modelaron tres procesos principales del aplicativo </w:t>
-      </w:r>
-      <w:r>
-        <w:rPr>
-          <w:rtl w:val="0"/>
-        </w:rPr>
-        <w:t xml:space="preserve">iMedical+</w:t>
-      </w:r>
-      <w:r>
-        <w:rPr>
-          <w:rtl w:val="0"/>
-        </w:rPr>
-        <w:t xml:space="preserve">: la gestión de citas, la atención médica y la administración multitenant de la plataforma. En cada diagrama, los carriles (lanes) representan a los actores del negocio y, siguiendo las buenas prácticas del modelado, se incorporan eventos de mensaje en cada traspaso de información entre roles. </w:t>
+        <w:t xml:space="preserve">Para representar los procesos del negocio de la clínica se utilizó la notación estándar BPMN 2.0, que permite documentar de forma clara las actividades, los roles y los flujos de trabajo de la organización (Qflow BPM, s.f.). El modelo se organizó de forma jerárquica, con un proceso general que muestra la operación de extremo a extremo y, dentro de él, tres subprocesos que contienen el detalle de cada etapa (la administración multitenant de la plataforma, la gestión de citas y la atención médica). Esta estructura conserva la continuidad del negocio y mantiene cada nivel en un tamaño comprensible. En todos los diagramas los carriles (lanes) representan a los actores del negocio y se emplean eventos de mensaje para señalar los traspasos de información entre roles. </w:t>
+      </w:r>
+    </w:p>
+    <w:p>
+      <w:pPr>
+        <w:pStyle w:val="Heading3"/>
+        <w:rPr/>
+      </w:pPr>
+      <w:bookmarkStart w:colFirst="0" w:colLast="0" w:name="_pgen109" w:id="109"/>
+      <w:bookmarkEnd w:id="109"/>
+      <w:r>
+        <w:rPr>
+          <w:rtl w:val="0"/>
+        </w:rPr>
+        <w:t xml:space="preserve">Proceso General: Gestión Integral de Servicios Clínicos</w:t>
+      </w:r>
+    </w:p>
+    <w:p>
+      <w:pPr>
+        <w:ind w:firstLine="720"/>
+        <w:rPr/>
+      </w:pPr>
+      <w:r>
+        <w:rPr>
+          <w:rtl w:val="0"/>
+        </w:rPr>
+        <w:t xml:space="preserve">El diagrama general presenta la operación completa de iMedical+ y el orden en que se encadenan sus etapas. El proceso inicia cuando la clínica solicita el servicio; a partir de ese momento iData S.A. ejecuta la administración del SaaS para dar de alta y configurar el tenant y, una vez que la clínica queda operativa, se desarrollan la gestión de citas y la atención médica. Cada una de estas tres etapas se representa como un subproceso, cuyo detalle se desarrolla en los apartados siguientes. Los carriles distinguen a los dos participantes, la clínica en su rol de cliente e iData S.A. como proveedor del servicio. </w:t>
+      </w:r>
+    </w:p>
+    <w:p>
+      <w:pPr>
+        <w:pStyle w:val="Heading5"/>
+        <w:rPr/>
+      </w:pPr>
+      <w:bookmarkStart w:colFirst="0" w:colLast="0" w:name="_pgen110" w:id="110"/>
+      <w:bookmarkEnd w:id="110"/>
+      <w:r>
+        <w:rPr>
+          <w:rtl w:val="0"/>
+        </w:rPr>
+        <w:t xml:space="preserve">Figura 1. </w:t>
+      </w:r>
+    </w:p>
+    <w:p>
+      <w:pPr>
+        <w:pStyle w:val="Heading6"/>
+        <w:rPr/>
+      </w:pPr>
+      <w:bookmarkStart w:colFirst="0" w:colLast="0" w:name="_pgen111" w:id="111"/>
+      <w:bookmarkEnd w:id="111"/>
+      <w:r>
+        <w:rPr>
+          <w:rtl w:val="0"/>
+        </w:rPr>
+        <w:t xml:space="preserve">Diagrama BPMN 2.0 del proceso general de iMedical+. Elaboración propia. </w:t>
+      </w:r>
+    </w:p>
+    <w:p>
+      <w:pPr>
+        <w:rPr/>
+      </w:pPr>
+      <w:r>
+        <w:rPr/>
+        <w:drawing>
+          <wp:inline distB="114300" distT="114300" distL="114300" distR="114300">
+            <wp:extent cx="5943600" cy="1862698"/>
+            <wp:effectExtent b="0" l="0" r="0" t="0"/>
+            <wp:docPr id="90" name="image15.png"/>
+            <a:graphic>
+              <a:graphicData uri="http://schemas.openxmlformats.org/drawingml/2006/picture">
+                <pic:pic>
+                  <pic:nvPicPr>
+                    <pic:cNvPr id="0" name="image15.png"/>
+                    <pic:cNvPicPr preferRelativeResize="0"/>
+                  </pic:nvPicPr>
+                  <pic:blipFill>
+                    <a:blip r:embed="rId24"/>
+                    <a:srcRect b="0" l="0" r="0" t="0"/>
+                    <a:stretch>
+                      <a:fillRect/>
+                    </a:stretch>
+                  </pic:blipFill>
+                  <pic:spPr>
+                    <a:xfrm>
+                      <a:off x="0" y="0"/>
+                      <a:ext cx="5943600" cy="1862698"/>
+                    </a:xfrm>
+                    <a:prstGeom prst="rect"/>
+                    <a:ln/>
+                  </pic:spPr>
+                </pic:pic>
+              </a:graphicData>
+            </a:graphic>
+          </wp:inline>
+        </w:drawing>
+      </w:r>
+      <w:r>
+        <w:rPr>
+          <w:rtl w:val="0"/>
+        </w:rPr>
       </w:r>
     </w:p>
     <w:p>
@@ -12726,7 +12683,7 @@
         <w:rPr>
           <w:rtl w:val="0"/>
         </w:rPr>
-        <w:t xml:space="preserve">Este proceso inicia cuando el paciente solicita una cita a través de la versión web o la aplicación móvil. La recepcionista recibe la solicitud y consulta la disponibilidad del médico; si no existe disponibilidad, propone una nueva fecha que el paciente puede aceptar o rechazar. Una vez confirmada la disponibilidad o la aceptación del paciente, la recepcionista registra la cita y el sistema la confirma y notifica al paciente, finalizando con la cita agendada. </w:t>
+        <w:t xml:space="preserve">Este proceso inicia cuando el paciente solicita una cita a través de la versión web o la aplicación móvil. La recepcionista recibe la solicitud y consulta la disponibilidad del médico; si no existe disponibilidad, propone una nueva fecha que el paciente puede aceptar o rechazar. Una vez confirmada la disponibilidad o la aceptación del paciente, la recepcionista registra la cita, la confirma y notifica al paciente, finalizando con la cita agendada. </w:t>
       </w:r>
     </w:p>
     <w:p>
@@ -12740,7 +12697,7 @@
         <w:rPr>
           <w:rtl w:val="0"/>
         </w:rPr>
-        <w:t xml:space="preserve">Figura 1. </w:t>
+        <w:t xml:space="preserve">Figura 2. </w:t>
       </w:r>
     </w:p>
     <w:p>
@@ -12765,7 +12722,7 @@
         <w:rPr/>
         <w:drawing>
           <wp:inline distB="114300" distT="114300" distL="114300" distR="114300">
-            <wp:extent cx="5943600" cy="1803400"/>
+            <wp:extent cx="5943600" cy="1146411"/>
             <wp:effectExtent b="0" l="0" r="0" t="0"/>
             <wp:docPr id="8" name="image9.png"/>
             <a:graphic>
@@ -12785,7 +12742,7 @@
                   <pic:spPr>
                     <a:xfrm>
                       <a:off x="0" y="0"/>
-                      <a:ext cx="5943600" cy="1803400"/>
+                      <a:ext cx="5943600" cy="1146411"/>
                     </a:xfrm>
                     <a:prstGeom prst="rect"/>
                     <a:ln/>
@@ -12825,7 +12782,7 @@
         <w:rPr>
           <w:rtl w:val="0"/>
         </w:rPr>
-        <w:t xml:space="preserve">Este proceso representa la atención del paciente desde su llegada a la clínica hasta el cierre de la consulta. La recepcionista verifica la cita y registra el ingreso; la asistente de enfermería toma los signos vitales y registra la información preliminar; y el médico consulta el expediente (creándolo si no existe), realiza la evaluación, registra los síntomas y genera el diagnóstico. Si el caso requiere tratamiento, el médico lo define, emite la receta y la asistente brinda las indicaciones al paciente. Finalmente, el sistema actualiza el expediente y guarda el historial de la consulta. </w:t>
+        <w:t xml:space="preserve">Este proceso representa la atención del paciente desde su llegada a la clínica hasta el cierre de la consulta. La recepcionista verifica la cita y registra el ingreso; la asistente de enfermería toma los signos vitales y registra la información preliminar; y el médico consulta el expediente (creándolo si no existe), realiza la evaluación, registra los síntomas y genera el diagnóstico. Si el caso requiere tratamiento, el médico lo define, emite la receta y la asistente brinda las indicaciones al paciente. Finalmente, el médico registra la consulta en el sistema, con lo que el expediente y el historial clínico quedan actualizados. </w:t>
       </w:r>
     </w:p>
     <w:p>
@@ -12839,7 +12796,7 @@
         <w:rPr>
           <w:rtl w:val="0"/>
         </w:rPr>
-        <w:t xml:space="preserve">Figura 2. </w:t>
+        <w:t xml:space="preserve">Figura 3. </w:t>
       </w:r>
     </w:p>
     <w:p>
@@ -12864,7 +12821,7 @@
         <w:rPr/>
         <w:drawing>
           <wp:inline distB="114300" distT="114300" distL="114300" distR="114300">
-            <wp:extent cx="5943600" cy="1447800"/>
+            <wp:extent cx="5943600" cy="1215813"/>
             <wp:effectExtent b="0" l="0" r="0" t="0"/>
             <wp:docPr id="7" name="image7.png"/>
             <a:graphic>
@@ -12884,7 +12841,7 @@
                   <pic:spPr>
                     <a:xfrm>
                       <a:off x="0" y="0"/>
-                      <a:ext cx="5943600" cy="1447800"/>
+                      <a:ext cx="5943600" cy="1215813"/>
                     </a:xfrm>
                     <a:prstGeom prst="rect"/>
                     <a:ln/>
@@ -12924,7 +12881,7 @@
         <w:rPr>
           <w:rtl w:val="0"/>
         </w:rPr>
-        <w:t xml:space="preserve">Este proceso describe el aprovisionamiento de una nueva clínica dentro de la plataforma multitenant. La jefatura solicita la contratación del servicio y el administrador de iData S.A. registra la clínica (tenant) y le asigna un plan; si el pago es confirmado, se crean los usuarios y roles, y el sistema configura el aislamiento de datos del tenant, activa el acceso y programa los respaldos automáticos. Por último, la jefatura consulta los reportes médicos y operativos de su clínica. </w:t>
+        <w:t xml:space="preserve">Este proceso describe el aprovisionamiento de una nueva clínica dentro de la plataforma multitenant. La jefatura solicita la contratación del servicio y el administrador de iData S.A. registra la clínica (tenant) y le asigna un plan; si el pago es confirmado, se crean los usuarios y roles de la clínica y el administrador la configura en el sistema. Por último, la jefatura consulta los reportes médicos y operativos de su clínica. </w:t>
       </w:r>
     </w:p>
     <w:p>
@@ -12938,7 +12895,7 @@
         <w:rPr>
           <w:rtl w:val="0"/>
         </w:rPr>
-        <w:t xml:space="preserve">Figura 3. </w:t>
+        <w:t xml:space="preserve">Figura 4. </w:t>
       </w:r>
     </w:p>
     <w:p>
@@ -12963,7 +12920,7 @@
         <w:rPr/>
         <w:drawing>
           <wp:inline distB="114300" distT="114300" distL="114300" distR="114300">
-            <wp:extent cx="5943600" cy="1689100"/>
+            <wp:extent cx="5943600" cy="1145161"/>
             <wp:effectExtent b="0" l="0" r="0" t="0"/>
             <wp:docPr id="9" name="image10.png"/>
             <a:graphic>
@@ -12983,7 +12940,7 @@
                   <pic:spPr>
                     <a:xfrm>
                       <a:off x="0" y="0"/>
-                      <a:ext cx="5943600" cy="1689100"/>
+                      <a:ext cx="5943600" cy="1145161"/>
                     </a:xfrm>
                     <a:prstGeom prst="rect"/>
                     <a:ln/>
@@ -13002,6 +12959,18 @@
     </w:p>
     <w:p>
       <w:pPr>
+        <w:ind w:firstLine="720"/>
+        <w:rPr/>
+      </w:pPr>
+      <w:r>
+        <w:rPr>
+          <w:rtl w:val="0"/>
+        </w:rPr>
+        <w:t xml:space="preserve">En la construcción de los diagramas se aplicaron tres criterios de modelado. En primer lugar, la operación se unificó en un proceso general con subprocesos, de modo que no se fragmente la continuidad del negocio y cada nivel conserve un tamaño comprensible. En segundo lugar, no se representan las tareas técnicas que el sistema ejecuta de forma automática, como la configuración interna del tenant o el guardado de registros, ya que BPMN describe el proceso del negocio y no su implementación; en su lugar se modela la acción que la persona realiza apoyándose en el sistema. Por último, las actividades se tipificaron según su naturaleza, distinguiendo las tareas de usuario, las manuales y las de envío o recepción de información, lo que permite identificar con precisión cómo se ejecuta cada paso del proceso. </w:t>
+      </w:r>
+    </w:p>
+    <w:p>
+      <w:pPr>
         <w:pStyle w:val="Heading2"/>
         <w:ind w:firstLine="360"/>
         <w:rPr/>
@@ -13024,19 +12993,7 @@
         <w:rPr>
           <w:rtl w:val="0"/>
         </w:rPr>
-        <w:t xml:space="preserve">Los casos de uso describen las interacciones entre los actores del negocio y el sistema </w:t>
-      </w:r>
-      <w:r>
-        <w:rPr>
-          <w:rtl w:val="0"/>
-        </w:rPr>
-        <w:t xml:space="preserve">iMedical+</w:t>
-      </w:r>
-      <w:r>
-        <w:rPr>
-          <w:rtl w:val="0"/>
-        </w:rPr>
-        <w:t xml:space="preserve">, mostrando las funcionalidades que cada actor puede realizar (Campos Castro, 2026c). A continuación se presentan los principales casos de uso del aplicativo, organizados por actor; en varios de ellos se emplea la relación «include» para representar el comportamiento común y reutilizable entre casos de uso. Se modelaron diez casos de uso que cubren los actores definidos: recepcionista, paciente, médico, asistente de enfermería, jefatura, administrador de iData y proveedores.</w:t>
+        <w:t xml:space="preserve">Los casos de uso describen las interacciones entre los actores del negocio y el sistema iMedical+, mostrando las funcionalidades que cada actor puede realizar. A continuación se presentan los principales casos de uso del aplicativo, organizados por actor; en varios de ellos se emplea la relación «include» para representar el comportamiento común y reutilizable entre casos de uso. Se modelaron diez casos de uso que cubren los actores definidos: recepcionista, paciente, médico, asistente de enfermería, jefatura, administrador de iData y proveedores.</w:t>
       </w:r>
     </w:p>
     <w:p>
@@ -13076,7 +13033,7 @@
         <w:rPr>
           <w:rtl w:val="0"/>
         </w:rPr>
-        <w:t xml:space="preserve">Figura 4. </w:t>
+        <w:t xml:space="preserve">Figura 5. </w:t>
       </w:r>
     </w:p>
     <w:p>
@@ -13175,7 +13132,7 @@
         <w:rPr>
           <w:rtl w:val="0"/>
         </w:rPr>
-        <w:t xml:space="preserve">Figura 5. </w:t>
+        <w:t xml:space="preserve">Figura 6. </w:t>
       </w:r>
     </w:p>
     <w:p>
@@ -13274,7 +13231,7 @@
         <w:rPr>
           <w:rtl w:val="0"/>
         </w:rPr>
-        <w:t xml:space="preserve">Figura 6. </w:t>
+        <w:t xml:space="preserve">Figura 7. </w:t>
       </w:r>
     </w:p>
     <w:p>
@@ -13373,7 +13330,7 @@
         <w:rPr>
           <w:rtl w:val="0"/>
         </w:rPr>
-        <w:t xml:space="preserve">Figura 7. </w:t>
+        <w:t xml:space="preserve">Figura 8. </w:t>
       </w:r>
     </w:p>
     <w:p>
@@ -13472,7 +13429,7 @@
         <w:rPr>
           <w:rtl w:val="0"/>
         </w:rPr>
-        <w:t xml:space="preserve">Figura 8. </w:t>
+        <w:t xml:space="preserve">Figura 9. </w:t>
       </w:r>
     </w:p>
     <w:p>
@@ -13571,7 +13528,7 @@
         <w:rPr>
           <w:rtl w:val="0"/>
         </w:rPr>
-        <w:t xml:space="preserve">Figura 9. </w:t>
+        <w:t xml:space="preserve">Figura 10. </w:t>
       </w:r>
     </w:p>
     <w:p>
@@ -13670,7 +13627,7 @@
         <w:rPr>
           <w:rtl w:val="0"/>
         </w:rPr>
-        <w:t xml:space="preserve">Figura 10. </w:t>
+        <w:t xml:space="preserve">Figura 11. </w:t>
       </w:r>
     </w:p>
     <w:p>
@@ -13769,7 +13726,7 @@
         <w:rPr>
           <w:rtl w:val="0"/>
         </w:rPr>
-        <w:t xml:space="preserve">Figura 11. </w:t>
+        <w:t xml:space="preserve">Figura 12. </w:t>
       </w:r>
     </w:p>
     <w:p>
@@ -13868,7 +13825,7 @@
         <w:rPr>
           <w:rtl w:val="0"/>
         </w:rPr>
-        <w:t xml:space="preserve">Figura 12. </w:t>
+        <w:t xml:space="preserve">Figura 13. </w:t>
       </w:r>
     </w:p>
     <w:p>
@@ -13967,7 +13924,7 @@
         <w:rPr>
           <w:rtl w:val="0"/>
         </w:rPr>
-        <w:t xml:space="preserve">Figura 13. </w:t>
+        <w:t xml:space="preserve">Figura 14. </w:t>
       </w:r>
     </w:p>
     <w:p>
@@ -14052,6 +14009,341 @@
     <w:p>
       <w:pPr>
         <w:pStyle w:val="Heading1"/>
+        <w:rPr/>
+      </w:pPr>
+      <w:bookmarkStart w:colFirst="0" w:colLast="0" w:name="_uml112" w:id="112"/>
+      <w:bookmarkEnd w:id="112"/>
+      <w:r>
+        <w:rPr>
+          <w:rtl w:val="0"/>
+        </w:rPr>
+        <w:t xml:space="preserve">Diagrama de Clases de UML</w:t>
+      </w:r>
+    </w:p>
+    <w:p>
+      <w:pPr>
+        <w:ind w:firstLine="720"/>
+        <w:rPr/>
+      </w:pPr>
+      <w:r>
+        <w:rPr>
+          <w:rtl w:val="0"/>
+        </w:rPr>
+        <w:t xml:space="preserve">El diagrama de clases muestra la estructura estática del sistema, con las clases que lo componen, sus atributos y métodos, y las relaciones entre ellas. Las clases se derivaron del modelo de datos de la plataforma, y los valores acotados, como los estados, se representan mediante enumeraciones. </w:t>
+      </w:r>
+    </w:p>
+    <w:p>
+      <w:pPr>
+        <w:pStyle w:val="Heading2"/>
+        <w:rPr/>
+      </w:pPr>
+      <w:bookmarkStart w:colFirst="0" w:colLast="0" w:name="_uml114" w:id="114"/>
+      <w:bookmarkEnd w:id="114"/>
+      <w:r>
+        <w:rPr>
+          <w:rtl w:val="0"/>
+        </w:rPr>
+        <w:t xml:space="preserve">Modelo General de Clases</w:t>
+      </w:r>
+    </w:p>
+    <w:p>
+      <w:pPr>
+        <w:ind w:firstLine="720"/>
+        <w:rPr/>
+      </w:pPr>
+      <w:r>
+        <w:rPr>
+          <w:rtl w:val="0"/>
+        </w:rPr>
+        <w:t xml:space="preserve">El modelo completo reúne las clases y enumeraciones de la aplicación, y permite ver cómo se articulan sus distintos subdominios. En los apartados siguientes se presenta dividido para facilitar su lectura. </w:t>
+      </w:r>
+    </w:p>
+    <w:p>
+      <w:pPr>
+        <w:pStyle w:val="Heading5"/>
+        <w:rPr/>
+      </w:pPr>
+      <w:bookmarkStart w:colFirst="0" w:colLast="0" w:name="_uml116" w:id="116"/>
+      <w:bookmarkEnd w:id="116"/>
+      <w:r>
+        <w:rPr>
+          <w:rtl w:val="0"/>
+        </w:rPr>
+        <w:t xml:space="preserve">Figura 15. </w:t>
+      </w:r>
+    </w:p>
+    <w:p>
+      <w:pPr>
+        <w:pStyle w:val="Heading6"/>
+        <w:rPr/>
+      </w:pPr>
+      <w:bookmarkStart w:colFirst="0" w:colLast="0" w:name="_uml117" w:id="117"/>
+      <w:bookmarkEnd w:id="117"/>
+      <w:r>
+        <w:rPr>
+          <w:rtl w:val="0"/>
+        </w:rPr>
+        <w:t xml:space="preserve">Diagrama de clases de UML del sistema iMedical+. Elaboración propia. </w:t>
+      </w:r>
+    </w:p>
+    <w:p>
+      <w:pPr>
+        <w:rPr/>
+      </w:pPr>
+      <w:r>
+        <w:rPr/>
+        <w:drawing>
+          <wp:inline distB="114300" distT="114300" distL="114300" distR="114300">
+            <wp:extent cx="5943600" cy="3501462"/>
+            <wp:effectExtent b="0" l="0" r="0" t="0"/>
+            <wp:docPr id="101" name="clases101"/>
+            <a:graphic>
+              <a:graphicData uri="http://schemas.openxmlformats.org/drawingml/2006/picture">
+                <pic:pic>
+                  <pic:nvPicPr>
+                    <pic:cNvPr id="0" name="clases101"/>
+                    <pic:cNvPicPr preferRelativeResize="0"/>
+                  </pic:nvPicPr>
+                  <pic:blipFill>
+                    <a:blip r:embed="rId25"/>
+                    <a:srcRect b="0" l="0" r="0" t="0"/>
+                    <a:stretch>
+                      <a:fillRect/>
+                    </a:stretch>
+                  </pic:blipFill>
+                  <pic:spPr>
+                    <a:xfrm>
+                      <a:off x="0" y="0"/>
+                      <a:ext cx="5943600" cy="3501462"/>
+                    </a:xfrm>
+                    <a:prstGeom prst="rect"/>
+                    <a:ln/>
+                  </pic:spPr>
+                </pic:pic>
+              </a:graphicData>
+            </a:graphic>
+          </wp:inline>
+        </w:drawing>
+      </w:r>
+      <w:r>
+        <w:rPr>
+          <w:rtl w:val="0"/>
+        </w:rPr>
+      </w:r>
+    </w:p>
+    <w:p>
+      <w:pPr>
+        <w:pStyle w:val="Heading2"/>
+        <w:rPr/>
+      </w:pPr>
+      <w:bookmarkStart w:colFirst="0" w:colLast="0" w:name="_uml118" w:id="118"/>
+      <w:bookmarkEnd w:id="118"/>
+      <w:r>
+        <w:rPr>
+          <w:rtl w:val="0"/>
+        </w:rPr>
+        <w:t xml:space="preserve">Núcleo Clínico</w:t>
+      </w:r>
+    </w:p>
+    <w:p>
+      <w:pPr>
+        <w:ind w:firstLine="720"/>
+        <w:rPr/>
+      </w:pPr>
+      <w:r>
+        <w:rPr>
+          <w:rtl w:val="0"/>
+        </w:rPr>
+        <w:t xml:space="preserve">Agrupa las clases que sostienen la atención del paciente, como el expediente clínico, las citas y las consultas, junto con los diagnósticos, tratamientos y recetas que se derivan de ellas. </w:t>
+      </w:r>
+    </w:p>
+    <w:p>
+      <w:pPr>
+        <w:pStyle w:val="Heading5"/>
+        <w:rPr/>
+      </w:pPr>
+      <w:bookmarkStart w:colFirst="0" w:colLast="0" w:name="_uml120" w:id="120"/>
+      <w:bookmarkEnd w:id="120"/>
+      <w:r>
+        <w:rPr>
+          <w:rtl w:val="0"/>
+        </w:rPr>
+        <w:t xml:space="preserve">Figura 16. </w:t>
+      </w:r>
+    </w:p>
+    <w:p>
+      <w:pPr>
+        <w:pStyle w:val="Heading6"/>
+        <w:rPr/>
+      </w:pPr>
+      <w:bookmarkStart w:colFirst="0" w:colLast="0" w:name="_uml121" w:id="121"/>
+      <w:bookmarkEnd w:id="121"/>
+      <w:r>
+        <w:rPr>
+          <w:rtl w:val="0"/>
+        </w:rPr>
+        <w:t xml:space="preserve">Diagrama de clases del núcleo clínico. Elaboración propia. </w:t>
+      </w:r>
+    </w:p>
+    <w:p>
+      <w:pPr>
+        <w:rPr/>
+      </w:pPr>
+      <w:r>
+        <w:rPr/>
+        <w:drawing>
+          <wp:inline distB="114300" distT="114300" distL="114300" distR="114300">
+            <wp:extent cx="5943600" cy="2555982"/>
+            <wp:effectExtent b="0" l="0" r="0" t="0"/>
+            <wp:docPr id="102" name="clases102"/>
+            <a:graphic>
+              <a:graphicData uri="http://schemas.openxmlformats.org/drawingml/2006/picture">
+                <pic:pic>
+                  <pic:nvPicPr>
+                    <pic:cNvPr id="0" name="clases102"/>
+                    <pic:cNvPicPr preferRelativeResize="0"/>
+                  </pic:nvPicPr>
+                  <pic:blipFill>
+                    <a:blip r:embed="rId26"/>
+                    <a:srcRect b="0" l="0" r="0" t="0"/>
+                    <a:stretch>
+                      <a:fillRect/>
+                    </a:stretch>
+                  </pic:blipFill>
+                  <pic:spPr>
+                    <a:xfrm>
+                      <a:off x="0" y="0"/>
+                      <a:ext cx="5943600" cy="2555982"/>
+                    </a:xfrm>
+                    <a:prstGeom prst="rect"/>
+                    <a:ln/>
+                  </pic:spPr>
+                </pic:pic>
+              </a:graphicData>
+            </a:graphic>
+          </wp:inline>
+        </w:drawing>
+      </w:r>
+      <w:r>
+        <w:rPr>
+          <w:rtl w:val="0"/>
+        </w:rPr>
+      </w:r>
+    </w:p>
+    <w:p>
+      <w:pPr>
+        <w:pStyle w:val="Heading2"/>
+        <w:rPr/>
+      </w:pPr>
+      <w:bookmarkStart w:colFirst="0" w:colLast="0" w:name="_uml122" w:id="122"/>
+      <w:bookmarkEnd w:id="122"/>
+      <w:r>
+        <w:rPr>
+          <w:rtl w:val="0"/>
+        </w:rPr>
+        <w:t xml:space="preserve">Plataforma, Seguridad e Inventario</w:t>
+      </w:r>
+    </w:p>
+    <w:p>
+      <w:pPr>
+        <w:ind w:firstLine="720"/>
+        <w:rPr/>
+      </w:pPr>
+      <w:r>
+        <w:rPr>
+          <w:rtl w:val="0"/>
+        </w:rPr>
+        <w:t xml:space="preserve">Reúne las clases de soporte a la operación, entre ellas la administración de cada clínica y su facturación, los usuarios y sus roles, el control de insumos y el registro de auditoría. </w:t>
+      </w:r>
+    </w:p>
+    <w:p>
+      <w:pPr>
+        <w:pStyle w:val="Heading5"/>
+        <w:rPr/>
+      </w:pPr>
+      <w:bookmarkStart w:colFirst="0" w:colLast="0" w:name="_uml124" w:id="124"/>
+      <w:bookmarkEnd w:id="124"/>
+      <w:r>
+        <w:rPr>
+          <w:rtl w:val="0"/>
+        </w:rPr>
+        <w:t xml:space="preserve">Figura 17. </w:t>
+      </w:r>
+    </w:p>
+    <w:p>
+      <w:pPr>
+        <w:pStyle w:val="Heading6"/>
+        <w:rPr/>
+      </w:pPr>
+      <w:bookmarkStart w:colFirst="0" w:colLast="0" w:name="_uml125" w:id="125"/>
+      <w:bookmarkEnd w:id="125"/>
+      <w:r>
+        <w:rPr>
+          <w:rtl w:val="0"/>
+        </w:rPr>
+        <w:t xml:space="preserve">Diagrama de clases de plataforma, seguridad e inventario. Elaboración propia. </w:t>
+      </w:r>
+    </w:p>
+    <w:p>
+      <w:pPr>
+        <w:rPr/>
+      </w:pPr>
+      <w:r>
+        <w:rPr/>
+        <w:drawing>
+          <wp:inline distB="114300" distT="114300" distL="114300" distR="114300">
+            <wp:extent cx="5943600" cy="4887040"/>
+            <wp:effectExtent b="0" l="0" r="0" t="0"/>
+            <wp:docPr id="103" name="clases103"/>
+            <a:graphic>
+              <a:graphicData uri="http://schemas.openxmlformats.org/drawingml/2006/picture">
+                <pic:pic>
+                  <pic:nvPicPr>
+                    <pic:cNvPr id="0" name="clases103"/>
+                    <pic:cNvPicPr preferRelativeResize="0"/>
+                  </pic:nvPicPr>
+                  <pic:blipFill>
+                    <a:blip r:embed="rId27"/>
+                    <a:srcRect b="0" l="0" r="0" t="0"/>
+                    <a:stretch>
+                      <a:fillRect/>
+                    </a:stretch>
+                  </pic:blipFill>
+                  <pic:spPr>
+                    <a:xfrm>
+                      <a:off x="0" y="0"/>
+                      <a:ext cx="5943600" cy="4887040"/>
+                    </a:xfrm>
+                    <a:prstGeom prst="rect"/>
+                    <a:ln/>
+                  </pic:spPr>
+                </pic:pic>
+              </a:graphicData>
+            </a:graphic>
+          </wp:inline>
+        </w:drawing>
+      </w:r>
+      <w:r>
+        <w:rPr>
+          <w:rtl w:val="0"/>
+        </w:rPr>
+      </w:r>
+    </w:p>
+    <w:p>
+      <w:pPr>
+        <w:ind w:firstLine="720"/>
+        <w:rPr/>
+      </w:pPr>
+      <w:r>
+        <w:rPr>
+          <w:rtl w:val="0"/>
+        </w:rPr>
+        <w:t xml:space="preserve">En el diseño, Medico se modela como una especialización de Usuario para no duplicar los datos de acceso, y cada clase agrupa los métodos propios de su responsabilidad. </w:t>
+      </w:r>
+    </w:p>
+    <w:p>
+      <w:pPr>
+        <w:pStyle w:val="Heading1"/>
         <w:jc w:val="both"/>
         <w:rPr/>
       </w:pPr>
@@ -14076,21 +14368,7 @@
           <w:highlight w:val="yellow"/>
           <w:rtl w:val="0"/>
         </w:rPr>
-        <w:t xml:space="preserve">En este primer avance del proyecto se logró comprender y estructurar de manera clara el contexto de </w:t>
-      </w:r>
-      <w:r>
-        <w:rPr>
-          <w:highlight w:val="yellow"/>
-          <w:rtl w:val="0"/>
-        </w:rPr>
-        <w:t xml:space="preserve">iMedical+</w:t>
-      </w:r>
-      <w:r>
-        <w:rPr>
-          <w:highlight w:val="yellow"/>
-          <w:rtl w:val="0"/>
-        </w:rPr>
-        <w:t xml:space="preserve">, una plataforma SaaS multitenant para la gestión de clínicas, identificando su dominio de negocio, subdominios principales y el lenguaje ubicuo que permite estandarizar la comunicación entre los distintos actores del sistema. Este análisis fue clave para sentar las bases de la solución propuesta y asegurar que responda a las necesidades reales del entorno clínico y del modelo de alquiler a múltiples clínicas.</w:t>
+        <w:t xml:space="preserve">En este primer avance del proyecto se logró comprender y estructurar de manera clara el contexto de iMedical+, una plataforma SaaS multitenant para la gestión de clínicas, identificando su dominio de negocio, subdominios principales y el lenguaje ubicuo que permite estandarizar la comunicación entre los distintos actores del sistema. Este análisis fue clave para sentar las bases de la solución propuesta y asegurar que responda a las necesidades reales del entorno clínico y del modelo de alquiler a múltiples clínicas.</w:t>
       </w:r>
     </w:p>
     <w:p>
@@ -14166,19 +14444,7 @@
         <w:rPr>
           <w:rtl w:val="0"/>
         </w:rPr>
-        <w:t xml:space="preserve">Se recomienda que una futura implementación de </w:t>
-      </w:r>
-      <w:r>
-        <w:rPr>
-          <w:rtl w:val="0"/>
-        </w:rPr>
-        <w:t xml:space="preserve">iMedical+</w:t>
-      </w:r>
-      <w:r>
-        <w:rPr>
-          <w:rtl w:val="0"/>
-        </w:rPr>
-        <w:t xml:space="preserve"> mantenga como prioridad el aislamiento de la información entre clínicas, evitando accesos cruzados entre tenants tanto en la lógica de la aplicación como en la base de datos.</w:t>
+        <w:t xml:space="preserve">Se recomienda que una futura implementación de iMedical+ mantenga como prioridad el aislamiento de la información entre clínicas, evitando accesos cruzados entre tenants tanto en la lógica de la aplicación como en la base de datos.</w:t>
       </w:r>
     </w:p>
     <w:p>

</xml_diff>